<commit_message>
Copy-edits to documents (protocol, Word version of questionnaires, and interim report)
</commit_message>
<xml_diff>
--- a/Questionnaires/End-process - qq itn distribution - v5.docx
+++ b/Questionnaires/End-process - qq itn distribution - v5.docx
@@ -9,8 +9,8 @@
           <w:rFonts w:ascii="Calibri" w:hAnsi="Calibri" w:cs="Calibri"/>
           <w:b/>
           <w:bCs/>
-          <w:sz w:val="24"/>
-          <w:szCs w:val="24"/>
+          <w:sz w:val="28"/>
+          <w:szCs w:val="28"/>
         </w:rPr>
       </w:pPr>
       <w:r>
@@ -31,7 +31,7 @@
           <w:sz w:val="28"/>
           <w:szCs w:val="28"/>
         </w:rPr>
-        <w:t>End</w:t>
+        <w:t>e</w:t>
       </w:r>
       <w:r>
         <w:rPr>
@@ -41,17 +41,7 @@
           <w:sz w:val="28"/>
           <w:szCs w:val="28"/>
         </w:rPr>
-        <w:t>-Process Assessment of HHR Process</w:t>
-      </w:r>
-      <w:r>
-        <w:rPr>
-          <w:rFonts w:ascii="Calibri" w:hAnsi="Calibri" w:cs="Calibri"/>
-          <w:b/>
-          <w:bCs/>
-          <w:sz w:val="28"/>
-          <w:szCs w:val="28"/>
-        </w:rPr>
-        <w:t xml:space="preserve">: </w:t>
+        <w:t xml:space="preserve">nd-process assessment of ITN campaign </w:t>
       </w:r>
       <w:commentRangeStart w:id="0"/>
       <w:r>
@@ -62,34 +52,31 @@
           <w:sz w:val="28"/>
           <w:szCs w:val="28"/>
         </w:rPr>
-        <w:t xml:space="preserve">Assessing </w:t>
+        <w:t>distribution</w:t>
+      </w:r>
+      <w:commentRangeEnd w:id="0"/>
+      <w:r>
+        <w:rPr>
+          <w:rStyle w:val="CommentReference"/>
+          <w:rFonts w:ascii="Calibri" w:hAnsi="Calibri" w:cs="Calibri"/>
+          <w:b/>
+          <w:bCs/>
+          <w:sz w:val="28"/>
+          <w:szCs w:val="28"/>
+          <w:vertAlign w:val="superscript"/>
+        </w:rPr>
+        <w:commentReference w:id="0"/>
       </w:r>
       <w:r>
         <w:rPr>
+          <w:rStyle w:val="FootnoteReference"/>
           <w:rFonts w:ascii="Calibri" w:hAnsi="Calibri" w:cs="Calibri"/>
           <w:b/>
           <w:bCs/>
           <w:sz w:val="28"/>
           <w:szCs w:val="28"/>
         </w:rPr>
-        <w:t xml:space="preserve">ITN </w:t>
-      </w:r>
-      <w:r>
-        <w:rPr>
-          <w:rFonts w:ascii="Calibri" w:hAnsi="Calibri" w:cs="Calibri"/>
-          <w:b/>
-          <w:bCs/>
-          <w:sz w:val="28"/>
-          <w:szCs w:val="28"/>
-        </w:rPr>
-        <w:t>Distribution</w:t>
-      </w:r>
-      <w:commentRangeEnd w:id="0"/>
-      <w:r>
-        <w:rPr>
-          <w:rStyle w:val="CommentReference"/>
-        </w:rPr>
-        <w:commentReference w:id="0"/>
+        <w:t xml:space="preserve"> </w:t>
       </w:r>
     </w:p>
     <w:p>
@@ -947,43 +934,43 @@
                 <w:sz w:val="20"/>
                 <w:szCs w:val="20"/>
               </w:rPr>
-              <w:t>1  =  Completed interview</w:t>
-            </w:r>
-          </w:p>
-          <w:p>
-            <w:pPr>
-              <w:spacing w:after="0"/>
-              <w:rPr>
-                <w:rFonts w:ascii="Calibri" w:eastAsia="Calibri" w:hAnsi="Calibri" w:cs="Calibri"/>
-                <w:sz w:val="20"/>
-                <w:szCs w:val="20"/>
-              </w:rPr>
-            </w:pPr>
-            <w:r>
-              <w:rPr>
-                <w:rFonts w:ascii="Calibri" w:eastAsia="Calibri" w:hAnsi="Calibri" w:cs="Calibri"/>
-                <w:sz w:val="20"/>
-                <w:szCs w:val="20"/>
-              </w:rPr>
-              <w:t>2  =  Eligible respondent not available</w:t>
-            </w:r>
-          </w:p>
-          <w:p>
-            <w:pPr>
-              <w:spacing w:after="0"/>
-              <w:rPr>
-                <w:rFonts w:ascii="Calibri" w:eastAsia="Calibri" w:hAnsi="Calibri" w:cs="Calibri"/>
-                <w:sz w:val="20"/>
-                <w:szCs w:val="20"/>
-              </w:rPr>
-            </w:pPr>
-            <w:r>
-              <w:rPr>
-                <w:rFonts w:ascii="Calibri" w:eastAsia="Calibri" w:hAnsi="Calibri" w:cs="Calibri"/>
-                <w:sz w:val="20"/>
-                <w:szCs w:val="20"/>
-              </w:rPr>
-              <w:t>3  =  Refused</w:t>
+              <w:t>1 = Completed interview</w:t>
+            </w:r>
+          </w:p>
+          <w:p>
+            <w:pPr>
+              <w:spacing w:after="0"/>
+              <w:rPr>
+                <w:rFonts w:ascii="Calibri" w:eastAsia="Calibri" w:hAnsi="Calibri" w:cs="Calibri"/>
+                <w:sz w:val="20"/>
+                <w:szCs w:val="20"/>
+              </w:rPr>
+            </w:pPr>
+            <w:r>
+              <w:rPr>
+                <w:rFonts w:ascii="Calibri" w:eastAsia="Calibri" w:hAnsi="Calibri" w:cs="Calibri"/>
+                <w:sz w:val="20"/>
+                <w:szCs w:val="20"/>
+              </w:rPr>
+              <w:t>2 = Eligible respondent not available</w:t>
+            </w:r>
+          </w:p>
+          <w:p>
+            <w:pPr>
+              <w:spacing w:after="0"/>
+              <w:rPr>
+                <w:rFonts w:ascii="Calibri" w:eastAsia="Calibri" w:hAnsi="Calibri" w:cs="Calibri"/>
+                <w:sz w:val="20"/>
+                <w:szCs w:val="20"/>
+              </w:rPr>
+            </w:pPr>
+            <w:r>
+              <w:rPr>
+                <w:rFonts w:ascii="Calibri" w:eastAsia="Calibri" w:hAnsi="Calibri" w:cs="Calibri"/>
+                <w:sz w:val="20"/>
+                <w:szCs w:val="20"/>
+              </w:rPr>
+              <w:t>3 = Refused</w:t>
             </w:r>
           </w:p>
         </w:tc>
@@ -1705,7 +1692,7 @@
           <w:rFonts w:ascii="Calibri" w:eastAsia="Calibri" w:hAnsi="Calibri" w:cs="Calibri"/>
           <w:bCs/>
         </w:rPr>
-        <w:t>You have been informed about the assessment’s purpose, procedures, possible benefits, and risks.</w:t>
+        <w:t>You have been informed about the assessment’s purpose, procedures, possible benefits and risks.</w:t>
       </w:r>
     </w:p>
     <w:p>
@@ -2714,7 +2701,7 @@
                 <w:sz w:val="20"/>
                 <w:szCs w:val="20"/>
               </w:rPr>
-              <w:t>s issued to households</w:t>
+              <w:t xml:space="preserve">s issued to </w:t>
             </w:r>
             <w:r>
               <w:rPr>
@@ -2726,7 +2713,19 @@
                 <w:sz w:val="20"/>
                 <w:szCs w:val="20"/>
               </w:rPr>
-              <w:t>,  scan the machine-readable code or enter the human-readable code.</w:t>
+              <w:t>households, scan</w:t>
+            </w:r>
+            <w:r>
+              <w:rPr>
+                <w:rFonts w:ascii="Calibri" w:eastAsia="Calibri" w:hAnsi="Calibri" w:cs="Calibri"/>
+                <w:bCs/>
+                <w:i/>
+                <w:iCs/>
+                <w:color w:val="0F9ED5" w:themeColor="accent4"/>
+                <w:sz w:val="20"/>
+                <w:szCs w:val="20"/>
+              </w:rPr>
+              <w:t xml:space="preserve"> the machine-readable code or enter the human-readable code.</w:t>
             </w:r>
           </w:p>
           <w:p>
@@ -2778,9 +2777,9 @@
           <w:szCs w:val="24"/>
         </w:rPr>
         <w:sectPr>
-          <w:footerReference w:type="even" r:id="rId15"/>
-          <w:footerReference w:type="default" r:id="rId16"/>
-          <w:footerReference w:type="first" r:id="rId17"/>
+          <w:footerReference w:type="even" r:id="rId14"/>
+          <w:footerReference w:type="default" r:id="rId15"/>
+          <w:footerReference w:type="first" r:id="rId16"/>
           <w:pgSz w:w="11906" w:h="16838"/>
           <w:pgMar w:top="1440" w:right="1080" w:bottom="1440" w:left="1080" w:header="567" w:footer="567" w:gutter="0"/>
           <w:cols w:space="708"/>
@@ -2847,7 +2846,7 @@
                 <w:sz w:val="24"/>
                 <w:szCs w:val="24"/>
               </w:rPr>
-              <w:t>SECTION 1: People living in the household</w:t>
+              <w:t>SECTION 1: People living</w:t>
             </w:r>
             <w:r>
               <w:rPr>
@@ -2856,7 +2855,43 @@
                 <w:sz w:val="24"/>
                 <w:szCs w:val="24"/>
               </w:rPr>
-              <w:t xml:space="preserve"> (Household roster)</w:t>
+              <w:t xml:space="preserve"> </w:t>
+            </w:r>
+            <w:r>
+              <w:rPr>
+                <w:rFonts w:ascii="Calibri" w:eastAsia="Calibri" w:hAnsi="Calibri" w:cs="Calibri"/>
+                <w:b/>
+                <w:sz w:val="24"/>
+                <w:szCs w:val="24"/>
+              </w:rPr>
+              <w:t>in the household</w:t>
+            </w:r>
+            <w:r>
+              <w:rPr>
+                <w:rFonts w:ascii="Calibri" w:eastAsia="Calibri" w:hAnsi="Calibri" w:cs="Calibri"/>
+                <w:b/>
+                <w:sz w:val="24"/>
+                <w:szCs w:val="24"/>
+              </w:rPr>
+              <w:t xml:space="preserve"> (</w:t>
+            </w:r>
+            <w:r>
+              <w:rPr>
+                <w:rFonts w:ascii="Calibri" w:eastAsia="Calibri" w:hAnsi="Calibri" w:cs="Calibri"/>
+                <w:b/>
+                <w:sz w:val="24"/>
+                <w:szCs w:val="24"/>
+              </w:rPr>
+              <w:t>h</w:t>
+            </w:r>
+            <w:r>
+              <w:rPr>
+                <w:rFonts w:ascii="Calibri" w:eastAsia="Calibri" w:hAnsi="Calibri" w:cs="Calibri"/>
+                <w:b/>
+                <w:sz w:val="24"/>
+                <w:szCs w:val="24"/>
+              </w:rPr>
+              <w:t>ousehold roster)</w:t>
             </w:r>
           </w:p>
         </w:tc>
@@ -2920,6 +2955,12 @@
             <w:r>
               <w:rPr>
                 <w:rStyle w:val="CommentReference"/>
+                <w:rFonts w:ascii="Calibri" w:eastAsia="Calibri" w:hAnsi="Calibri" w:cs="Calibri"/>
+                <w:bCs/>
+                <w:i/>
+                <w:iCs/>
+                <w:sz w:val="22"/>
+                <w:szCs w:val="22"/>
               </w:rPr>
               <w:commentReference w:id="1"/>
             </w:r>
@@ -3091,6 +3132,13 @@
             <w:r>
               <w:rPr>
                 <w:rStyle w:val="CommentReference"/>
+                <w:rFonts w:ascii="Calibri" w:eastAsia="Calibri" w:hAnsi="Calibri" w:cs="Calibri"/>
+                <w:b/>
+                <w:i/>
+                <w:iCs/>
+                <w:color w:val="00B0F0"/>
+                <w:sz w:val="18"/>
+                <w:szCs w:val="18"/>
               </w:rPr>
               <w:commentReference w:id="2"/>
             </w:r>
@@ -3210,6 +3258,10 @@
             <w:r>
               <w:rPr>
                 <w:rStyle w:val="CommentReference"/>
+                <w:rFonts w:ascii="Calibri" w:eastAsia="Calibri" w:hAnsi="Calibri" w:cs="Calibri"/>
+                <w:b/>
+                <w:sz w:val="18"/>
+                <w:szCs w:val="18"/>
               </w:rPr>
               <w:commentReference w:id="3"/>
             </w:r>
@@ -3777,6 +3829,9 @@
             <w:r>
               <w:rPr>
                 <w:rStyle w:val="CommentReference"/>
+                <w:rFonts w:ascii="Calibri" w:eastAsia="Calibri" w:hAnsi="Calibri" w:cs="Calibri"/>
+                <w:sz w:val="18"/>
+                <w:szCs w:val="18"/>
               </w:rPr>
               <w:commentReference w:id="4"/>
             </w:r>
@@ -3828,9 +3883,8 @@
                 <w:sz w:val="18"/>
                 <w:szCs w:val="18"/>
               </w:rPr>
-              <w:t xml:space="preserve"> or </w:t>
-            </w:r>
-            <w:proofErr w:type="gramStart"/>
+              <w:t xml:space="preserve"> or other</w:t>
+            </w:r>
             <w:r>
               <w:rPr>
                 <w:rFonts w:ascii="Calibri" w:eastAsia="Calibri" w:hAnsi="Calibri" w:cs="Calibri"/>
@@ -3840,9 +3894,8 @@
                 <w:sz w:val="18"/>
                 <w:szCs w:val="18"/>
               </w:rPr>
-              <w:t>other</w:t>
-            </w:r>
-            <w:proofErr w:type="gramEnd"/>
+              <w:t xml:space="preserve"> </w:t>
+            </w:r>
             <w:r>
               <w:rPr>
                 <w:rFonts w:ascii="Calibri" w:eastAsia="Calibri" w:hAnsi="Calibri" w:cs="Calibri"/>
@@ -3852,7 +3905,7 @@
                 <w:sz w:val="18"/>
                 <w:szCs w:val="18"/>
               </w:rPr>
-              <w:t xml:space="preserve"> vulnerable group</w:t>
+              <w:t>vulnerable group</w:t>
             </w:r>
             <w:r>
               <w:rPr>
@@ -3929,7 +3982,23 @@
                 <w:sz w:val="18"/>
                 <w:szCs w:val="18"/>
               </w:rPr>
-              <w:t>If less than 1 year enter 00.</w:t>
+              <w:t xml:space="preserve">If less than </w:t>
+            </w:r>
+            <w:r>
+              <w:rPr>
+                <w:rFonts w:ascii="Calibri" w:eastAsia="Calibri" w:hAnsi="Calibri" w:cs="Calibri"/>
+                <w:sz w:val="18"/>
+                <w:szCs w:val="18"/>
+              </w:rPr>
+              <w:t>one</w:t>
+            </w:r>
+            <w:r>
+              <w:rPr>
+                <w:rFonts w:ascii="Calibri" w:eastAsia="Calibri" w:hAnsi="Calibri" w:cs="Calibri"/>
+                <w:sz w:val="18"/>
+                <w:szCs w:val="18"/>
+              </w:rPr>
+              <w:t xml:space="preserve"> year enter 00.</w:t>
             </w:r>
           </w:p>
           <w:p>
@@ -5472,6 +5541,9 @@
             <w:r>
               <w:rPr>
                 <w:rStyle w:val="CommentReference"/>
+                <w:rFonts w:ascii="Calibri" w:eastAsia="Calibri" w:hAnsi="Calibri" w:cs="Calibri"/>
+                <w:sz w:val="18"/>
+                <w:szCs w:val="18"/>
               </w:rPr>
               <w:commentReference w:id="5"/>
             </w:r>
@@ -11640,6 +11712,9 @@
             <w:r>
               <w:rPr>
                 <w:rStyle w:val="CommentReference"/>
+                <w:rFonts w:ascii="Calibri" w:eastAsia="Calibri" w:hAnsi="Calibri" w:cs="Calibri"/>
+                <w:sz w:val="20"/>
+                <w:szCs w:val="20"/>
               </w:rPr>
               <w:commentReference w:id="7"/>
             </w:r>
@@ -16293,6 +16368,9 @@
             <w:r>
               <w:rPr>
                 <w:rStyle w:val="CommentReference"/>
+                <w:rFonts w:ascii="Calibri" w:eastAsia="Calibri" w:hAnsi="Calibri" w:cs="Calibri"/>
+                <w:sz w:val="20"/>
+                <w:szCs w:val="20"/>
               </w:rPr>
               <w:commentReference w:id="8"/>
             </w:r>
@@ -27012,7 +27090,23 @@
                 <w:sz w:val="20"/>
                 <w:szCs w:val="20"/>
               </w:rPr>
-              <w:t xml:space="preserve">total number ITNs that this household owns </w:t>
+              <w:t xml:space="preserve">total number </w:t>
+            </w:r>
+            <w:r>
+              <w:rPr>
+                <w:rFonts w:ascii="Calibri" w:eastAsia="Calibri" w:hAnsi="Calibri" w:cs="Calibri"/>
+                <w:sz w:val="20"/>
+                <w:szCs w:val="20"/>
+              </w:rPr>
+              <w:t xml:space="preserve">of </w:t>
+            </w:r>
+            <w:r>
+              <w:rPr>
+                <w:rFonts w:ascii="Calibri" w:eastAsia="Calibri" w:hAnsi="Calibri" w:cs="Calibri"/>
+                <w:sz w:val="20"/>
+                <w:szCs w:val="20"/>
+              </w:rPr>
+              <w:t xml:space="preserve">ITNs that this household owns </w:t>
             </w:r>
             <w:r>
               <w:rPr>
@@ -27028,7 +27122,15 @@
                 <w:sz w:val="20"/>
                 <w:szCs w:val="20"/>
               </w:rPr>
-              <w:t xml:space="preserve">can be used for sleeping under is  </w:t>
+              <w:t xml:space="preserve">can be used for sleeping under </w:t>
+            </w:r>
+            <w:r>
+              <w:rPr>
+                <w:rFonts w:ascii="Calibri" w:eastAsia="Calibri" w:hAnsi="Calibri" w:cs="Calibri"/>
+                <w:sz w:val="20"/>
+                <w:szCs w:val="20"/>
+              </w:rPr>
+              <w:t>is [</w:t>
             </w:r>
             <w:r>
               <w:rPr>
@@ -27037,7 +27139,7 @@
                 <w:sz w:val="20"/>
                 <w:szCs w:val="20"/>
               </w:rPr>
-              <w:t xml:space="preserve">[Autocompleted: </w:t>
+              <w:t xml:space="preserve">Autocompleted: </w:t>
             </w:r>
             <w:r>
               <w:rPr>
@@ -33013,7 +33115,7 @@
 
 <file path=word/comments.xml><?xml version="1.0" encoding="utf-8"?>
 <w:comments xmlns:wpc="http://schemas.microsoft.com/office/word/2010/wordprocessingCanvas" xmlns:cx="http://schemas.microsoft.com/office/drawing/2014/chartex" xmlns:cx1="http://schemas.microsoft.com/office/drawing/2015/9/8/chartex" xmlns:cx2="http://schemas.microsoft.com/office/drawing/2015/10/21/chartex" xmlns:cx3="http://schemas.microsoft.com/office/drawing/2016/5/9/chartex" xmlns:cx4="http://schemas.microsoft.com/office/drawing/2016/5/10/chartex" xmlns:cx5="http://schemas.microsoft.com/office/drawing/2016/5/11/chartex" xmlns:cx6="http://schemas.microsoft.com/office/drawing/2016/5/12/chartex" xmlns:cx7="http://schemas.microsoft.com/office/drawing/2016/5/13/chartex" xmlns:cx8="http://schemas.microsoft.com/office/drawing/2016/5/14/chartex" xmlns:mc="http://schemas.openxmlformats.org/markup-compatibility/2006" xmlns:aink="http://schemas.microsoft.com/office/drawing/2016/ink" xmlns:am3d="http://schemas.microsoft.com/office/drawing/2017/model3d" xmlns:o="urn:schemas-microsoft-com:office:office" xmlns:oel="http://schemas.microsoft.com/office/2019/extlst" xmlns:r="http://schemas.openxmlformats.org/officeDocument/2006/relationships" xmlns:m="http://schemas.openxmlformats.org/officeDocument/2006/math" xmlns:v="urn:schemas-microsoft-com:vml" xmlns:wp14="http://schemas.microsoft.com/office/word/2010/wordprocessingDrawing" xmlns:wp="http://schemas.openxmlformats.org/drawingml/2006/wordprocessingDrawing" xmlns:w10="urn:schemas-microsoft-com:office:word" xmlns:w="http://schemas.openxmlformats.org/wordprocessingml/2006/main" xmlns:w14="http://schemas.microsoft.com/office/word/2010/wordml" xmlns:w15="http://schemas.microsoft.com/office/word/2012/wordml" xmlns:w16cex="http://schemas.microsoft.com/office/word/2018/wordml/cex" xmlns:w16cid="http://schemas.microsoft.com/office/word/2016/wordml/cid" xmlns:w16="http://schemas.microsoft.com/office/word/2018/wordml" xmlns:w16du="http://schemas.microsoft.com/office/word/2023/wordml/word16du" xmlns:w16sdtdh="http://schemas.microsoft.com/office/word/2020/wordml/sdtdatahash" xmlns:w16sdtfl="http://schemas.microsoft.com/office/word/2024/wordml/sdtformatlock" xmlns:w16se="http://schemas.microsoft.com/office/word/2015/wordml/symex" xmlns:wpg="http://schemas.microsoft.com/office/word/2010/wordprocessingGroup" xmlns:wpi="http://schemas.microsoft.com/office/word/2010/wordprocessingInk" xmlns:wne="http://schemas.microsoft.com/office/word/2006/wordml" xmlns:wps="http://schemas.microsoft.com/office/word/2010/wordprocessingShape" mc:Ignorable="w14 w15 w16se w16cid w16 w16cex w16sdtdh w16sdtfl w16du wp14">
-  <w:comment w:id="0" w:author="Steve Poyer  | Tropical Health" w:date="2025-07-08T09:22:00Z" w:initials="SP">
+  <w:comment w:id="0" w:author="Author" w:initials="A">
     <w:p>
       <w:pPr>
         <w:pStyle w:val="CommentText"/>
@@ -33078,7 +33180,7 @@
       </w:r>
     </w:p>
   </w:comment>
-  <w:comment w:id="1" w:author="Steve Poyer  | Tropical Health" w:date="2025-07-08T14:57:00Z" w:initials="SP">
+  <w:comment w:id="1" w:author="Author" w:initials="A">
     <w:p>
       <w:pPr>
         <w:pStyle w:val="CommentText"/>
@@ -33113,7 +33215,7 @@
       </w:r>
     </w:p>
   </w:comment>
-  <w:comment w:id="2" w:author="Eleanore Sternberg | Tropical Health" w:date="2025-10-14T17:24:00Z" w:initials="ES">
+  <w:comment w:id="2" w:author="Author" w:initials="A">
     <w:p>
       <w:pPr>
         <w:pStyle w:val="CommentText"/>
@@ -33145,7 +33247,7 @@
       </w:r>
     </w:p>
   </w:comment>
-  <w:comment w:id="3" w:author="Steve Poyer  | Tropical Health" w:date="2025-07-08T14:57:00Z" w:initials="SP">
+  <w:comment w:id="3" w:author="Author" w:initials="A">
     <w:p>
       <w:pPr>
         <w:pStyle w:val="CommentText"/>
@@ -33188,7 +33290,7 @@
       </w:r>
     </w:p>
   </w:comment>
-  <w:comment w:id="4" w:author="Steve Poyer  | Tropical Health" w:date="2025-07-15T19:22:00Z" w:initials="SP">
+  <w:comment w:id="4" w:author="Author" w:initials="A">
     <w:p>
       <w:pPr>
         <w:pStyle w:val="CommentText"/>
@@ -33223,7 +33325,7 @@
       </w:r>
     </w:p>
   </w:comment>
-  <w:comment w:id="5" w:author="Steve Poyer  | Tropical Health" w:date="2025-08-05T11:02:00Z" w:initials="SP">
+  <w:comment w:id="5" w:author="Author" w:initials="A">
     <w:p>
       <w:pPr>
         <w:pStyle w:val="CommentText"/>
@@ -33258,7 +33360,7 @@
       </w:r>
     </w:p>
   </w:comment>
-  <w:comment w:id="7" w:author="Steve Poyer  | Tropical Health" w:date="2025-07-08T14:58:00Z" w:initials="SP">
+  <w:comment w:id="7" w:author="Author" w:initials="A">
     <w:p>
       <w:pPr>
         <w:pStyle w:val="CommentText"/>
@@ -33301,7 +33403,7 @@
       </w:r>
     </w:p>
   </w:comment>
-  <w:comment w:id="8" w:author="Steve Poyer  | Tropical Health" w:date="2025-07-08T14:58:00Z" w:initials="SP">
+  <w:comment w:id="8" w:author="Author" w:initials="A">
     <w:p>
       <w:pPr>
         <w:pStyle w:val="CommentText"/>
@@ -33341,7 +33443,7 @@
 
 <file path=word/commentsExtended.xml><?xml version="1.0" encoding="utf-8"?>
 <w15:commentsEx xmlns:wpc="http://schemas.microsoft.com/office/word/2010/wordprocessingCanvas" xmlns:cx="http://schemas.microsoft.com/office/drawing/2014/chartex" xmlns:cx1="http://schemas.microsoft.com/office/drawing/2015/9/8/chartex" xmlns:cx2="http://schemas.microsoft.com/office/drawing/2015/10/21/chartex" xmlns:cx3="http://schemas.microsoft.com/office/drawing/2016/5/9/chartex" xmlns:cx4="http://schemas.microsoft.com/office/drawing/2016/5/10/chartex" xmlns:cx5="http://schemas.microsoft.com/office/drawing/2016/5/11/chartex" xmlns:cx6="http://schemas.microsoft.com/office/drawing/2016/5/12/chartex" xmlns:cx7="http://schemas.microsoft.com/office/drawing/2016/5/13/chartex" xmlns:cx8="http://schemas.microsoft.com/office/drawing/2016/5/14/chartex" xmlns:mc="http://schemas.openxmlformats.org/markup-compatibility/2006" xmlns:aink="http://schemas.microsoft.com/office/drawing/2016/ink" xmlns:am3d="http://schemas.microsoft.com/office/drawing/2017/model3d" xmlns:o="urn:schemas-microsoft-com:office:office" xmlns:oel="http://schemas.microsoft.com/office/2019/extlst" xmlns:r="http://schemas.openxmlformats.org/officeDocument/2006/relationships" xmlns:m="http://schemas.openxmlformats.org/officeDocument/2006/math" xmlns:v="urn:schemas-microsoft-com:vml" xmlns:wp14="http://schemas.microsoft.com/office/word/2010/wordprocessingDrawing" xmlns:wp="http://schemas.openxmlformats.org/drawingml/2006/wordprocessingDrawing" xmlns:w10="urn:schemas-microsoft-com:office:word" xmlns:w="http://schemas.openxmlformats.org/wordprocessingml/2006/main" xmlns:w14="http://schemas.microsoft.com/office/word/2010/wordml" xmlns:w15="http://schemas.microsoft.com/office/word/2012/wordml" xmlns:w16cex="http://schemas.microsoft.com/office/word/2018/wordml/cex" xmlns:w16cid="http://schemas.microsoft.com/office/word/2016/wordml/cid" xmlns:w16="http://schemas.microsoft.com/office/word/2018/wordml" xmlns:w16du="http://schemas.microsoft.com/office/word/2023/wordml/word16du" xmlns:w16sdtdh="http://schemas.microsoft.com/office/word/2020/wordml/sdtdatahash" xmlns:w16sdtfl="http://schemas.microsoft.com/office/word/2024/wordml/sdtformatlock" xmlns:w16se="http://schemas.microsoft.com/office/word/2015/wordml/symex" xmlns:wpg="http://schemas.microsoft.com/office/word/2010/wordprocessingGroup" xmlns:wpi="http://schemas.microsoft.com/office/word/2010/wordprocessingInk" xmlns:wne="http://schemas.microsoft.com/office/word/2006/wordml" xmlns:wps="http://schemas.microsoft.com/office/word/2010/wordprocessingShape" mc:Ignorable="w14 w15 w16se w16cid w16 w16cex w16sdtdh w16sdtfl w16du wp14">
-  <w15:commentEx w15:paraId="16752A5E" w15:done="0"/>
+  <w15:commentEx w15:paraId="308EB0B3" w15:done="0"/>
   <w15:commentEx w15:paraId="0273BB38" w15:done="0"/>
   <w15:commentEx w15:paraId="47AD16E5" w15:done="0"/>
   <w15:commentEx w15:paraId="1E278AD6" w15:done="0"/>
@@ -33352,22 +33454,9 @@
 </w15:commentsEx>
 </file>
 
-<file path=word/commentsExtensible.xml><?xml version="1.0" encoding="utf-8"?>
-<w16cex:commentsExtensible xmlns:wpc="http://schemas.microsoft.com/office/word/2010/wordprocessingCanvas" xmlns:cx="http://schemas.microsoft.com/office/drawing/2014/chartex" xmlns:cx1="http://schemas.microsoft.com/office/drawing/2015/9/8/chartex" xmlns:cx2="http://schemas.microsoft.com/office/drawing/2015/10/21/chartex" xmlns:cx3="http://schemas.microsoft.com/office/drawing/2016/5/9/chartex" xmlns:cx4="http://schemas.microsoft.com/office/drawing/2016/5/10/chartex" xmlns:cx5="http://schemas.microsoft.com/office/drawing/2016/5/11/chartex" xmlns:cx6="http://schemas.microsoft.com/office/drawing/2016/5/12/chartex" xmlns:cx7="http://schemas.microsoft.com/office/drawing/2016/5/13/chartex" xmlns:cx8="http://schemas.microsoft.com/office/drawing/2016/5/14/chartex" xmlns:cr="http://schemas.microsoft.com/office/comments/2020/reactions" xmlns:mc="http://schemas.openxmlformats.org/markup-compatibility/2006" xmlns:aink="http://schemas.microsoft.com/office/drawing/2016/ink" xmlns:am3d="http://schemas.microsoft.com/office/drawing/2017/model3d" xmlns:o="urn:schemas-microsoft-com:office:office" xmlns:oel="http://schemas.microsoft.com/office/2019/extlst" xmlns:r="http://schemas.openxmlformats.org/officeDocument/2006/relationships" xmlns:m="http://schemas.openxmlformats.org/officeDocument/2006/math" xmlns:v="urn:schemas-microsoft-com:vml" xmlns:wp14="http://schemas.microsoft.com/office/word/2010/wordprocessingDrawing" xmlns:wp="http://schemas.openxmlformats.org/drawingml/2006/wordprocessingDrawing" xmlns:w10="urn:schemas-microsoft-com:office:word" xmlns:w="http://schemas.openxmlformats.org/wordprocessingml/2006/main" xmlns:w14="http://schemas.microsoft.com/office/word/2010/wordml" xmlns:w15="http://schemas.microsoft.com/office/word/2012/wordml" xmlns:w16cex="http://schemas.microsoft.com/office/word/2018/wordml/cex" xmlns:w16cid="http://schemas.microsoft.com/office/word/2016/wordml/cid" xmlns:w16="http://schemas.microsoft.com/office/word/2018/wordml" xmlns:w16du="http://schemas.microsoft.com/office/word/2023/wordml/word16du" xmlns:w16sdtdh="http://schemas.microsoft.com/office/word/2020/wordml/sdtdatahash" xmlns:w16sdtfl="http://schemas.microsoft.com/office/word/2024/wordml/sdtformatlock" xmlns:w16se="http://schemas.microsoft.com/office/word/2015/wordml/symex" xmlns:wpg="http://schemas.microsoft.com/office/word/2010/wordprocessingGroup" xmlns:wpi="http://schemas.microsoft.com/office/word/2010/wordprocessingInk" xmlns:wne="http://schemas.microsoft.com/office/word/2006/wordml" xmlns:wps="http://schemas.microsoft.com/office/word/2010/wordprocessingShape" mc:Ignorable="w14 w15 w16se w16cid w16 w16cex w16sdtdh w16sdtfl cr w16du wp14">
-  <w16cex:commentExtensible w16cex:durableId="5B39B1B8" w16cex:dateUtc="2025-07-08T08:22:00Z"/>
-  <w16cex:commentExtensible w16cex:durableId="2E2DFEF9" w16cex:dateUtc="2025-07-08T13:57:00Z"/>
-  <w16cex:commentExtensible w16cex:durableId="2198D6E5" w16cex:dateUtc="2025-10-14T16:24:00Z"/>
-  <w16cex:commentExtensible w16cex:durableId="14675256" w16cex:dateUtc="2025-07-08T13:57:00Z"/>
-  <w16cex:commentExtensible w16cex:durableId="53F0B0F5" w16cex:dateUtc="2025-07-15T18:22:00Z"/>
-  <w16cex:commentExtensible w16cex:durableId="40FEC8D4" w16cex:dateUtc="2025-08-05T10:02:00Z"/>
-  <w16cex:commentExtensible w16cex:durableId="37CB7414" w16cex:dateUtc="2025-07-08T13:58:00Z"/>
-  <w16cex:commentExtensible w16cex:durableId="3336D3CA" w16cex:dateUtc="2025-07-08T13:58:00Z"/>
-</w16cex:commentsExtensible>
-</file>
-
 <file path=word/commentsIds.xml><?xml version="1.0" encoding="utf-8"?>
 <w16cid:commentsIds xmlns:wpc="http://schemas.microsoft.com/office/word/2010/wordprocessingCanvas" xmlns:cx="http://schemas.microsoft.com/office/drawing/2014/chartex" xmlns:cx1="http://schemas.microsoft.com/office/drawing/2015/9/8/chartex" xmlns:cx2="http://schemas.microsoft.com/office/drawing/2015/10/21/chartex" xmlns:cx3="http://schemas.microsoft.com/office/drawing/2016/5/9/chartex" xmlns:cx4="http://schemas.microsoft.com/office/drawing/2016/5/10/chartex" xmlns:cx5="http://schemas.microsoft.com/office/drawing/2016/5/11/chartex" xmlns:cx6="http://schemas.microsoft.com/office/drawing/2016/5/12/chartex" xmlns:cx7="http://schemas.microsoft.com/office/drawing/2016/5/13/chartex" xmlns:cx8="http://schemas.microsoft.com/office/drawing/2016/5/14/chartex" xmlns:mc="http://schemas.openxmlformats.org/markup-compatibility/2006" xmlns:aink="http://schemas.microsoft.com/office/drawing/2016/ink" xmlns:am3d="http://schemas.microsoft.com/office/drawing/2017/model3d" xmlns:o="urn:schemas-microsoft-com:office:office" xmlns:oel="http://schemas.microsoft.com/office/2019/extlst" xmlns:r="http://schemas.openxmlformats.org/officeDocument/2006/relationships" xmlns:m="http://schemas.openxmlformats.org/officeDocument/2006/math" xmlns:v="urn:schemas-microsoft-com:vml" xmlns:wp14="http://schemas.microsoft.com/office/word/2010/wordprocessingDrawing" xmlns:wp="http://schemas.openxmlformats.org/drawingml/2006/wordprocessingDrawing" xmlns:w10="urn:schemas-microsoft-com:office:word" xmlns:w="http://schemas.openxmlformats.org/wordprocessingml/2006/main" xmlns:w14="http://schemas.microsoft.com/office/word/2010/wordml" xmlns:w15="http://schemas.microsoft.com/office/word/2012/wordml" xmlns:w16cex="http://schemas.microsoft.com/office/word/2018/wordml/cex" xmlns:w16cid="http://schemas.microsoft.com/office/word/2016/wordml/cid" xmlns:w16="http://schemas.microsoft.com/office/word/2018/wordml" xmlns:w16du="http://schemas.microsoft.com/office/word/2023/wordml/word16du" xmlns:w16sdtdh="http://schemas.microsoft.com/office/word/2020/wordml/sdtdatahash" xmlns:w16sdtfl="http://schemas.microsoft.com/office/word/2024/wordml/sdtformatlock" xmlns:w16se="http://schemas.microsoft.com/office/word/2015/wordml/symex" xmlns:wpg="http://schemas.microsoft.com/office/word/2010/wordprocessingGroup" xmlns:wpi="http://schemas.microsoft.com/office/word/2010/wordprocessingInk" xmlns:wne="http://schemas.microsoft.com/office/word/2006/wordml" xmlns:wps="http://schemas.microsoft.com/office/word/2010/wordprocessingShape" mc:Ignorable="w14 w15 w16se w16cid w16 w16cex w16sdtdh w16sdtfl w16du wp14">
-  <w16cid:commentId w16cid:paraId="16752A5E" w16cid:durableId="5B39B1B8"/>
+  <w16cid:commentId w16cid:paraId="308EB0B3" w16cid:durableId="5219EBF7"/>
   <w16cid:commentId w16cid:paraId="0273BB38" w16cid:durableId="2E2DFEF9"/>
   <w16cid:commentId w16cid:paraId="47AD16E5" w16cid:durableId="2198D6E5"/>
   <w16cid:commentId w16cid:paraId="1E278AD6" w16cid:durableId="14675256"/>
@@ -34255,17 +34344,6 @@
   </w:num>
   <w:numIdMacAtCleanup w:val="3"/>
 </w:numbering>
-</file>
-
-<file path=word/people.xml><?xml version="1.0" encoding="utf-8"?>
-<w15:people xmlns:wpc="http://schemas.microsoft.com/office/word/2010/wordprocessingCanvas" xmlns:cx="http://schemas.microsoft.com/office/drawing/2014/chartex" xmlns:cx1="http://schemas.microsoft.com/office/drawing/2015/9/8/chartex" xmlns:cx2="http://schemas.microsoft.com/office/drawing/2015/10/21/chartex" xmlns:cx3="http://schemas.microsoft.com/office/drawing/2016/5/9/chartex" xmlns:cx4="http://schemas.microsoft.com/office/drawing/2016/5/10/chartex" xmlns:cx5="http://schemas.microsoft.com/office/drawing/2016/5/11/chartex" xmlns:cx6="http://schemas.microsoft.com/office/drawing/2016/5/12/chartex" xmlns:cx7="http://schemas.microsoft.com/office/drawing/2016/5/13/chartex" xmlns:cx8="http://schemas.microsoft.com/office/drawing/2016/5/14/chartex" xmlns:mc="http://schemas.openxmlformats.org/markup-compatibility/2006" xmlns:aink="http://schemas.microsoft.com/office/drawing/2016/ink" xmlns:am3d="http://schemas.microsoft.com/office/drawing/2017/model3d" xmlns:o="urn:schemas-microsoft-com:office:office" xmlns:oel="http://schemas.microsoft.com/office/2019/extlst" xmlns:r="http://schemas.openxmlformats.org/officeDocument/2006/relationships" xmlns:m="http://schemas.openxmlformats.org/officeDocument/2006/math" xmlns:v="urn:schemas-microsoft-com:vml" xmlns:wp14="http://schemas.microsoft.com/office/word/2010/wordprocessingDrawing" xmlns:wp="http://schemas.openxmlformats.org/drawingml/2006/wordprocessingDrawing" xmlns:w10="urn:schemas-microsoft-com:office:word" xmlns:w="http://schemas.openxmlformats.org/wordprocessingml/2006/main" xmlns:w14="http://schemas.microsoft.com/office/word/2010/wordml" xmlns:w15="http://schemas.microsoft.com/office/word/2012/wordml" xmlns:w16cex="http://schemas.microsoft.com/office/word/2018/wordml/cex" xmlns:w16cid="http://schemas.microsoft.com/office/word/2016/wordml/cid" xmlns:w16="http://schemas.microsoft.com/office/word/2018/wordml" xmlns:w16du="http://schemas.microsoft.com/office/word/2023/wordml/word16du" xmlns:w16sdtdh="http://schemas.microsoft.com/office/word/2020/wordml/sdtdatahash" xmlns:w16sdtfl="http://schemas.microsoft.com/office/word/2024/wordml/sdtformatlock" xmlns:w16se="http://schemas.microsoft.com/office/word/2015/wordml/symex" xmlns:wpg="http://schemas.microsoft.com/office/word/2010/wordprocessingGroup" xmlns:wpi="http://schemas.microsoft.com/office/word/2010/wordprocessingInk" xmlns:wne="http://schemas.microsoft.com/office/word/2006/wordml" xmlns:wps="http://schemas.microsoft.com/office/word/2010/wordprocessingShape" mc:Ignorable="w14 w15 w16se w16cid w16 w16cex w16sdtdh w16sdtfl w16du wp14">
-  <w15:person w15:author="Steve Poyer  | Tropical Health">
-    <w15:presenceInfo w15:providerId="AD" w15:userId="S::steve@trophealth.com::d9aa2b46-98b6-4eb5-89bb-6e82ef6edbad"/>
-  </w15:person>
-  <w15:person w15:author="Eleanore Sternberg | Tropical Health">
-    <w15:presenceInfo w15:providerId="AD" w15:userId="S::Eleanore@trophealth.com::fc5c40e3-42bf-4d73-907d-c6feae9991a5"/>
-  </w15:person>
-</w15:people>
 </file>
 
 <file path=word/styles.xml><?xml version="1.0" encoding="utf-8"?>
@@ -37243,8 +37321,8 @@
 </file>
 
 <file path=customXml/item1.xml><?xml version="1.0" encoding="utf-8"?>
-<ct:contentTypeSchema xmlns:ct="http://schemas.microsoft.com/office/2006/metadata/contentType" xmlns:ma="http://schemas.microsoft.com/office/2006/metadata/properties/metaAttributes" ct:_="" ma:_="" ma:contentTypeName="Document" ma:contentTypeID="0x010100BF11AF2F54683D48B47D51E7C5C20D0A" ma:contentTypeVersion="21" ma:contentTypeDescription="Create a new document." ma:contentTypeScope="" ma:versionID="739c6c93e1fa3242103328fd7c6fd4fe">
-  <xsd:schema xmlns:xsd="http://www.w3.org/2001/XMLSchema" xmlns:xs="http://www.w3.org/2001/XMLSchema" xmlns:p="http://schemas.microsoft.com/office/2006/metadata/properties" xmlns:ns2="7a2ce8f2-2204-4367-a41c-b735e7c03037" xmlns:ns3="f53cdae7-58e9-463a-80c4-ff1f1a52caeb" targetNamespace="http://schemas.microsoft.com/office/2006/metadata/properties" ma:root="true" ma:fieldsID="23a554fc1540e055b3dda9e0febfb003" ns2:_="" ns3:_="">
+<ct:contentTypeSchema xmlns:ct="http://schemas.microsoft.com/office/2006/metadata/contentType" xmlns:ma="http://schemas.microsoft.com/office/2006/metadata/properties/metaAttributes" ct:_="" ma:_="" ma:contentTypeName="Document" ma:contentTypeID="0x010100BF11AF2F54683D48B47D51E7C5C20D0A" ma:contentTypeVersion="21" ma:contentTypeDescription="Create a new document." ma:contentTypeScope="" ma:versionID="6c3ec6b3112fff6afcb2e1bceac7318f">
+  <xsd:schema xmlns:xsd="http://www.w3.org/2001/XMLSchema" xmlns:xs="http://www.w3.org/2001/XMLSchema" xmlns:p="http://schemas.microsoft.com/office/2006/metadata/properties" xmlns:ns2="7a2ce8f2-2204-4367-a41c-b735e7c03037" xmlns:ns3="f53cdae7-58e9-463a-80c4-ff1f1a52caeb" targetNamespace="http://schemas.microsoft.com/office/2006/metadata/properties" ma:root="true" ma:fieldsID="1733b412cddd9f821d661af390973bad" ns2:_="" ns3:_="">
     <xsd:import namespace="7a2ce8f2-2204-4367-a41c-b735e7c03037"/>
     <xsd:import namespace="f53cdae7-58e9-463a-80c4-ff1f1a52caeb"/>
     <xsd:element name="properties">
@@ -37524,10 +37602,6 @@
 <file path=customXml/item3.xml><?xml version="1.0" encoding="utf-8"?>
 <p:properties xmlns:p="http://schemas.microsoft.com/office/2006/metadata/properties" xmlns:xsi="http://www.w3.org/2001/XMLSchema-instance" xmlns:pc="http://schemas.microsoft.com/office/infopath/2007/PartnerControls">
   <documentManagement>
-    <TaxCatchAll xmlns="f53cdae7-58e9-463a-80c4-ff1f1a52caeb" xsi:nil="true"/>
-    <lcf76f155ced4ddcb4097134ff3c332f xmlns="7a2ce8f2-2204-4367-a41c-b735e7c03037">
-      <Terms xmlns="http://schemas.microsoft.com/office/infopath/2007/PartnerControls"/>
-    </lcf76f155ced4ddcb4097134ff3c332f>
     <Person xmlns="7a2ce8f2-2204-4367-a41c-b735e7c03037">
       <UserInfo>
         <DisplayName/>
@@ -37535,6 +37609,10 @@
         <AccountType/>
       </UserInfo>
     </Person>
+    <lcf76f155ced4ddcb4097134ff3c332f xmlns="7a2ce8f2-2204-4367-a41c-b735e7c03037">
+      <Terms xmlns="http://schemas.microsoft.com/office/infopath/2007/PartnerControls"/>
+    </lcf76f155ced4ddcb4097134ff3c332f>
+    <TaxCatchAll xmlns="f53cdae7-58e9-463a-80c4-ff1f1a52caeb" xsi:nil="true"/>
   </documentManagement>
 </p:properties>
 </file>
@@ -37549,7 +37627,7 @@
 </file>
 
 <file path=customXml/itemProps1.xml><?xml version="1.0" encoding="utf-8"?>
-<ds:datastoreItem xmlns:ds="http://schemas.openxmlformats.org/officeDocument/2006/customXml" ds:itemID="{353C6D45-7EA4-469E-B4BD-CBE1323C6533}">
+<ds:datastoreItem xmlns:ds="http://schemas.openxmlformats.org/officeDocument/2006/customXml" ds:itemID="{4F881DCF-C60E-43A1-9164-FBFE895C5CEA}">
   <ds:schemaRefs>
     <ds:schemaRef ds:uri="http://schemas.microsoft.com/office/2006/metadata/contentType"/>
     <ds:schemaRef ds:uri="http://schemas.microsoft.com/office/2006/metadata/properties/metaAttributes"/>
@@ -37576,18 +37654,18 @@
 </file>
 
 <file path=customXml/itemProps3.xml><?xml version="1.0" encoding="utf-8"?>
-<ds:datastoreItem xmlns:ds="http://schemas.openxmlformats.org/officeDocument/2006/customXml" ds:itemID="{DC23E726-2486-4D7A-87AB-CFE997A66B30}">
+<ds:datastoreItem xmlns:ds="http://schemas.openxmlformats.org/officeDocument/2006/customXml" ds:itemID="{0C7C07C8-E285-4245-A96C-CF9B9F23183F}">
   <ds:schemaRefs>
     <ds:schemaRef ds:uri="http://schemas.microsoft.com/office/2006/metadata/properties"/>
     <ds:schemaRef ds:uri="http://schemas.microsoft.com/office/infopath/2007/PartnerControls"/>
+    <ds:schemaRef ds:uri="7a2ce8f2-2204-4367-a41c-b735e7c03037"/>
     <ds:schemaRef ds:uri="f53cdae7-58e9-463a-80c4-ff1f1a52caeb"/>
-    <ds:schemaRef ds:uri="7a2ce8f2-2204-4367-a41c-b735e7c03037"/>
   </ds:schemaRefs>
 </ds:datastoreItem>
 </file>
 
 <file path=customXml/itemProps4.xml><?xml version="1.0" encoding="utf-8"?>
-<ds:datastoreItem xmlns:ds="http://schemas.openxmlformats.org/officeDocument/2006/customXml" ds:itemID="{9AE78001-793C-41E1-927C-E3CFCC5EA843}">
+<ds:datastoreItem xmlns:ds="http://schemas.openxmlformats.org/officeDocument/2006/customXml" ds:itemID="{252E77EF-94CC-4FC0-8E3B-9A5DA3BB78BA}">
   <ds:schemaRefs>
     <ds:schemaRef ds:uri="http://schemas.microsoft.com/sharepoint/v3/contenttype/forms"/>
   </ds:schemaRefs>

</xml_diff>